<commit_message>
Adapt UI for 800x600 and update manual screenshots
</commit_message>
<xml_diff>
--- a/docs/SLSEleven_User_Manual_FULL.docx
+++ b/docs/SLSEleven_User_Manual_FULL.docx
@@ -3659,7 +3659,7 @@
       <w:r>
         <w:drawing>
           <wp:inline xmlns:a="http://schemas.openxmlformats.org/drawingml/2006/main" xmlns:pic="http://schemas.openxmlformats.org/drawingml/2006/picture">
-            <wp:extent cx="5852160" cy="3291840"/>
+            <wp:extent cx="5852160" cy="4593945"/>
             <wp:docPr id="4" name="Picture 4"/>
             <wp:cNvGraphicFramePr>
               <a:graphicFrameLocks noChangeAspect="1"/>
@@ -3680,7 +3680,7 @@
                   <pic:spPr>
                     <a:xfrm>
                       <a:off x="0" y="0"/>
-                      <a:ext cx="5852160" cy="3291840"/>
+                      <a:ext cx="5852160" cy="4593945"/>
                     </a:xfrm>
                     <a:prstGeom prst="rect"/>
                   </pic:spPr>
@@ -3697,7 +3697,7 @@
         <w:jc w:val="center"/>
       </w:pPr>
       <w:r>
-        <w:t>Рисунок 4 — Плейсхолдер скриншота первого запуска.</w:t>
+        <w:t>Рисунок 4 — Первый запуск приложения.</w:t>
       </w:r>
     </w:p>
     <w:p>
@@ -3860,7 +3860,7 @@
       <w:r>
         <w:drawing>
           <wp:inline xmlns:a="http://schemas.openxmlformats.org/drawingml/2006/main" xmlns:pic="http://schemas.openxmlformats.org/drawingml/2006/picture">
-            <wp:extent cx="5852160" cy="3291840"/>
+            <wp:extent cx="5852160" cy="4593945"/>
             <wp:docPr id="5" name="Picture 5"/>
             <wp:cNvGraphicFramePr>
               <a:graphicFrameLocks noChangeAspect="1"/>
@@ -3869,11 +3869,11 @@
               <a:graphicData uri="http://schemas.openxmlformats.org/drawingml/2006/picture">
                 <pic:pic>
                   <pic:nvPicPr>
-                    <pic:cNvPr id="0" name="calendar_overview.png"/>
+                    <pic:cNvPr id="0" name="first_launch.png"/>
                     <pic:cNvPicPr/>
                   </pic:nvPicPr>
                   <pic:blipFill>
-                    <a:blip r:embed="rId15"/>
+                    <a:blip r:embed="rId14"/>
                     <a:stretch>
                       <a:fillRect/>
                     </a:stretch>
@@ -3881,7 +3881,7 @@
                   <pic:spPr>
                     <a:xfrm>
                       <a:off x="0" y="0"/>
-                      <a:ext cx="5852160" cy="3291840"/>
+                      <a:ext cx="5852160" cy="4593945"/>
                     </a:xfrm>
                     <a:prstGeom prst="rect"/>
                   </pic:spPr>
@@ -3898,7 +3898,7 @@
         <w:jc w:val="center"/>
       </w:pPr>
       <w:r>
-        <w:t>Рисунок 5 — Плейсхолдер общего вида календаря.</w:t>
+        <w:t>Рисунок 5 — Общий вид календаря в окне 800 x 600.</w:t>
       </w:r>
     </w:p>
     <w:tbl>
@@ -4912,7 +4912,7 @@
       <w:r>
         <w:drawing>
           <wp:inline xmlns:a="http://schemas.openxmlformats.org/drawingml/2006/main" xmlns:pic="http://schemas.openxmlformats.org/drawingml/2006/picture">
-            <wp:extent cx="5852160" cy="3291840"/>
+            <wp:extent cx="5852160" cy="4260372"/>
             <wp:docPr id="6" name="Picture 6"/>
             <wp:cNvGraphicFramePr>
               <a:graphicFrameLocks noChangeAspect="1"/>
@@ -4925,7 +4925,7 @@
                     <pic:cNvPicPr/>
                   </pic:nvPicPr>
                   <pic:blipFill>
-                    <a:blip r:embed="rId16"/>
+                    <a:blip r:embed="rId15"/>
                     <a:stretch>
                       <a:fillRect/>
                     </a:stretch>
@@ -4933,7 +4933,7 @@
                   <pic:spPr>
                     <a:xfrm>
                       <a:off x="0" y="0"/>
-                      <a:ext cx="5852160" cy="3291840"/>
+                      <a:ext cx="5852160" cy="4260372"/>
                     </a:xfrm>
                     <a:prstGeom prst="rect"/>
                   </pic:spPr>
@@ -4950,7 +4950,7 @@
         <w:jc w:val="center"/>
       </w:pPr>
       <w:r>
-        <w:t>Рисунок 6 — Плейсхолдер экрана «Все занятия».</w:t>
+        <w:t>Рисунок 6 — Экран «Все занятия».</w:t>
       </w:r>
     </w:p>
     <w:tbl>
@@ -5592,7 +5592,7 @@
       <w:r>
         <w:drawing>
           <wp:inline xmlns:a="http://schemas.openxmlformats.org/drawingml/2006/main" xmlns:pic="http://schemas.openxmlformats.org/drawingml/2006/picture">
-            <wp:extent cx="5852160" cy="3291840"/>
+            <wp:extent cx="5852160" cy="3873066"/>
             <wp:docPr id="7" name="Picture 7"/>
             <wp:cNvGraphicFramePr>
               <a:graphicFrameLocks noChangeAspect="1"/>
@@ -5605,7 +5605,7 @@
                     <pic:cNvPicPr/>
                   </pic:nvPicPr>
                   <pic:blipFill>
-                    <a:blip r:embed="rId17"/>
+                    <a:blip r:embed="rId16"/>
                     <a:stretch>
                       <a:fillRect/>
                     </a:stretch>
@@ -5613,7 +5613,7 @@
                   <pic:spPr>
                     <a:xfrm>
                       <a:off x="0" y="0"/>
-                      <a:ext cx="5852160" cy="3291840"/>
+                      <a:ext cx="5852160" cy="3873066"/>
                     </a:xfrm>
                     <a:prstGeom prst="rect"/>
                   </pic:spPr>
@@ -5630,7 +5630,7 @@
         <w:jc w:val="center"/>
       </w:pPr>
       <w:r>
-        <w:t>Рисунок 7 — Плейсхолдер экрана «Авторасписание».</w:t>
+        <w:t>Рисунок 7 — Экран «Авторасписание».</w:t>
       </w:r>
     </w:p>
     <w:tbl>

</xml_diff>

<commit_message>
Update manual authors and logo
</commit_message>
<xml_diff>
--- a/docs/SLSEleven_User_Manual_FULL.docx
+++ b/docs/SLSEleven_User_Manual_FULL.docx
@@ -2,6 +2,45 @@
 <file path=word/document.xml><?xml version="1.0" encoding="utf-8"?>
 <w:document xmlns:wpc="http://schemas.microsoft.com/office/word/2010/wordprocessingCanvas" xmlns:mo="http://schemas.microsoft.com/office/mac/office/2008/main" xmlns:mc="http://schemas.openxmlformats.org/markup-compatibility/2006" xmlns:mv="urn:schemas-microsoft-com:mac:vml" xmlns:o="urn:schemas-microsoft-com:office:office" xmlns:r="http://schemas.openxmlformats.org/officeDocument/2006/relationships" xmlns:m="http://schemas.openxmlformats.org/officeDocument/2006/math" xmlns:v="urn:schemas-microsoft-com:vml" xmlns:wp14="http://schemas.microsoft.com/office/word/2010/wordprocessingDrawing" xmlns:wp="http://schemas.openxmlformats.org/drawingml/2006/wordprocessingDrawing" xmlns:w10="urn:schemas-microsoft-com:office:word" xmlns:w="http://schemas.openxmlformats.org/wordprocessingml/2006/main" xmlns:w14="http://schemas.microsoft.com/office/word/2010/wordml" xmlns:wpg="http://schemas.microsoft.com/office/word/2010/wordprocessingGroup" xmlns:wpi="http://schemas.microsoft.com/office/word/2010/wordprocessingInk" xmlns:wne="http://schemas.microsoft.com/office/word/2006/wordml" xmlns:wps="http://schemas.microsoft.com/office/word/2010/wordprocessingShape" mc:Ignorable="w14 wp14">
   <w:body>
+    <w:p>
+      <w:pPr>
+        <w:jc w:val="center"/>
+      </w:pPr>
+      <w:r>
+        <w:drawing>
+          <wp:inline xmlns:a="http://schemas.openxmlformats.org/drawingml/2006/main" xmlns:pic="http://schemas.openxmlformats.org/drawingml/2006/picture">
+            <wp:extent cx="1325880" cy="1325880"/>
+            <wp:docPr id="1" name="Picture 1"/>
+            <wp:cNvGraphicFramePr>
+              <a:graphicFrameLocks noChangeAspect="1"/>
+            </wp:cNvGraphicFramePr>
+            <a:graphic>
+              <a:graphicData uri="http://schemas.openxmlformats.org/drawingml/2006/picture">
+                <pic:pic>
+                  <pic:nvPicPr>
+                    <pic:cNvPr id="0" name="logo.png"/>
+                    <pic:cNvPicPr/>
+                  </pic:nvPicPr>
+                  <pic:blipFill>
+                    <a:blip r:embed="rId11"/>
+                    <a:stretch>
+                      <a:fillRect/>
+                    </a:stretch>
+                  </pic:blipFill>
+                  <pic:spPr>
+                    <a:xfrm>
+                      <a:off x="0" y="0"/>
+                      <a:ext cx="1325880" cy="1325880"/>
+                    </a:xfrm>
+                    <a:prstGeom prst="rect"/>
+                  </pic:spPr>
+                </pic:pic>
+              </a:graphicData>
+            </a:graphic>
+          </wp:inline>
+        </w:drawing>
+      </w:r>
+    </w:p>
     <w:p>
       <w:pPr>
         <w:jc w:val="center"/>
@@ -12,8 +51,6 @@
           <w:color w:val="1F4E79"/>
           <w:sz w:val="64"/>
         </w:rPr>
-        <w:br/>
-        <w:br/>
         <w:t>SLSEleven</w:t>
       </w:r>
     </w:p>
@@ -268,7 +305,7 @@
           </w:tcPr>
           <w:p>
             <w:r>
-              <w:t>Автор / организация</w:t>
+              <w:t>Авторы</w:t>
             </w:r>
           </w:p>
         </w:tc>
@@ -285,7 +322,9 @@
           </w:tcPr>
           <w:p>
             <w:r>
-              <w:t>SLSEleven</w:t>
+              <w:t>Капитан 2 ранга Киселев О.А.</w:t>
+              <w:br/>
+              <w:t>Старший матрос Гладких Е.Ю.</w:t>
             </w:r>
           </w:p>
         </w:tc>
@@ -304,7 +343,7 @@
           </w:tcPr>
           <w:p>
             <w:r>
-              <w:t>Статус</w:t>
+              <w:t>Организация</w:t>
             </w:r>
           </w:p>
         </w:tc>
@@ -321,7 +360,7 @@
           </w:tcPr>
           <w:p>
             <w:r>
-              <w:t>Готово к передаче пользователю</w:t>
+              <w:t>SLSEleven</w:t>
             </w:r>
           </w:p>
         </w:tc>
@@ -340,6 +379,42 @@
           </w:tcPr>
           <w:p>
             <w:r>
+              <w:t>Статус</w:t>
+            </w:r>
+          </w:p>
+        </w:tc>
+        <w:tc>
+          <w:tcPr>
+            <w:tcW w:type="dxa" w:w="5953"/>
+            <w:tcMar>
+              <w:top w:w="90" w:type="dxa"/>
+              <w:start w:w="110" w:type="dxa"/>
+              <w:bottom w:w="90" w:type="dxa"/>
+              <w:end w:w="110" w:type="dxa"/>
+            </w:tcMar>
+            <w:vAlign w:val="center"/>
+          </w:tcPr>
+          <w:p>
+            <w:r>
+              <w:t>Готово к передаче пользователю</w:t>
+            </w:r>
+          </w:p>
+        </w:tc>
+      </w:tr>
+      <w:tr>
+        <w:tc>
+          <w:tcPr>
+            <w:tcW w:type="dxa" w:w="2948"/>
+            <w:tcMar>
+              <w:top w:w="90" w:type="dxa"/>
+              <w:start w:w="110" w:type="dxa"/>
+              <w:bottom w:w="90" w:type="dxa"/>
+              <w:end w:w="110" w:type="dxa"/>
+            </w:tcMar>
+            <w:vAlign w:val="center"/>
+          </w:tcPr>
+          <w:p>
+            <w:r>
               <w:t>Логотип</w:t>
             </w:r>
           </w:p>
@@ -357,7 +432,7 @@
           </w:tcPr>
           <w:p>
             <w:r>
-              <w:t>[Требует уточнения] В репозитории обнаружены иконки приложения Windows/macOS, но отдельный логотип для документации не предоставлен.</w:t>
+              <w:t>Сгенерирован для документации SLSEleven.</w:t>
             </w:r>
           </w:p>
         </w:tc>
@@ -1736,44 +1811,11 @@
       </w:tr>
     </w:tbl>
     <w:p/>
-    <w:tbl>
-      <w:tblPr>
-        <w:tblW w:type="auto" w:w="0"/>
-        <w:jc w:val="center"/>
-        <w:tblLook w:firstColumn="1" w:firstRow="1" w:lastColumn="0" w:lastRow="0" w:noHBand="0" w:noVBand="1" w:val="04A0"/>
-      </w:tblPr>
-      <w:tblGrid>
-        <w:gridCol w:w="10142"/>
-      </w:tblGrid>
-      <w:tr>
-        <w:tc>
-          <w:tcPr>
-            <w:tcW w:type="dxa" w:w="10142"/>
-            <w:shd w:fill="FFF2CC"/>
-            <w:tcMar>
-              <w:top w:w="130" w:type="dxa"/>
-              <w:start w:w="160" w:type="dxa"/>
-              <w:bottom w:w="130" w:type="dxa"/>
-              <w:end w:w="160" w:type="dxa"/>
-            </w:tcMar>
-          </w:tcPr>
-          <w:p>
-            <w:r>
-              <w:rPr>
-                <w:b/>
-                <w:color w:val="7F6000"/>
-              </w:rPr>
-              <w:t>[Требует уточнения]</w:t>
-            </w:r>
-            <w:r>
-              <w:br/>
-              <w:t>Точные должности, порядок утверждения расписания и официальное наименование владельца системы не указаны в исходных материалах. В документе используется рабочая модель ролей: ответственный за расписание, командир/начальник, администратор рабочего места и сотрудник поддержки.</w:t>
-            </w:r>
-          </w:p>
-        </w:tc>
-      </w:tr>
-    </w:tbl>
-    <w:p/>
+    <w:p>
+      <w:r>
+        <w:t>Инструкция не привязана к конкретным военным должностям пользователей. В тексте используются нейтральные роли: пользователь, ответственный за расписание и специалист, выполняющий установку или обслуживание рабочего места.</w:t>
+      </w:r>
+    </w:p>
     <w:p>
       <w:pPr>
         <w:pStyle w:val="Heading1"/>
@@ -1931,7 +1973,7 @@
           </w:tcPr>
           <w:p>
             <w:r>
-              <w:t>Windows 10/11 [Требует уточнения]</w:t>
+              <w:t>Windows 7</w:t>
             </w:r>
           </w:p>
         </w:tc>
@@ -2529,7 +2571,7 @@
         <w:drawing>
           <wp:inline xmlns:a="http://schemas.openxmlformats.org/drawingml/2006/main" xmlns:pic="http://schemas.openxmlformats.org/drawingml/2006/picture">
             <wp:extent cx="5852160" cy="3291840"/>
-            <wp:docPr id="1" name="Picture 1"/>
+            <wp:docPr id="2" name="Picture 2"/>
             <wp:cNvGraphicFramePr>
               <a:graphicFrameLocks noChangeAspect="1"/>
             </wp:cNvGraphicFramePr>
@@ -2538,179 +2580,6 @@
                 <pic:pic>
                   <pic:nvPicPr>
                     <pic:cNvPr id="0" name="install_file.png"/>
-                    <pic:cNvPicPr/>
-                  </pic:nvPicPr>
-                  <pic:blipFill>
-                    <a:blip r:embed="rId11"/>
-                    <a:stretch>
-                      <a:fillRect/>
-                    </a:stretch>
-                  </pic:blipFill>
-                  <pic:spPr>
-                    <a:xfrm>
-                      <a:off x="0" y="0"/>
-                      <a:ext cx="5852160" cy="3291840"/>
-                    </a:xfrm>
-                    <a:prstGeom prst="rect"/>
-                  </pic:spPr>
-                </pic:pic>
-              </a:graphicData>
-            </a:graphic>
-          </wp:inline>
-        </w:drawing>
-      </w:r>
-    </w:p>
-    <w:p>
-      <w:pPr>
-        <w:pStyle w:val="Caption"/>
-        <w:jc w:val="center"/>
-      </w:pPr>
-      <w:r>
-        <w:t>Рисунок 1 — Плейсхолдер скриншота установочного файла.</w:t>
-      </w:r>
-    </w:p>
-    <w:p>
-      <w:pPr>
-        <w:pStyle w:val="Heading2"/>
-      </w:pPr>
-      <w:r>
-        <w:t>3.2 Установка на Windows</w:t>
-      </w:r>
-    </w:p>
-    <w:p>
-      <w:r>
-        <w:t>Ниже приведён основной порядок установки. Выполняйте действия строго по порядку. Если на экране появляется окно, которого нет в инструкции, не нажимайте случайные кнопки: прочитайте текст окна или обратитесь к ответственному.</w:t>
-      </w:r>
-    </w:p>
-    <w:p>
-      <w:pPr>
-        <w:ind w:left="397" w:hanging="255"/>
-      </w:pPr>
-      <w:r>
-        <w:rPr>
-          <w:b/>
-        </w:rPr>
-        <w:t xml:space="preserve">1. </w:t>
-      </w:r>
-      <w:r>
-        <w:t>Найдите установочный файл в папке, куда его передал ответственный: обычно это «Загрузки», «Документы» или отдельная папка подразделения.</w:t>
-      </w:r>
-    </w:p>
-    <w:p>
-      <w:pPr>
-        <w:ind w:left="397" w:hanging="255"/>
-      </w:pPr>
-      <w:r>
-        <w:rPr>
-          <w:b/>
-        </w:rPr>
-        <w:t xml:space="preserve">2. </w:t>
-      </w:r>
-      <w:r>
-        <w:t>Щёлкните по файлу два раза левой кнопкой мыши. Если двойной щелчок не получается, щёлкните один раз, затем нажмите клавишу Enter.</w:t>
-      </w:r>
-    </w:p>
-    <w:p>
-      <w:pPr>
-        <w:ind w:left="397" w:hanging="255"/>
-      </w:pPr>
-      <w:r>
-        <w:rPr>
-          <w:b/>
-        </w:rPr>
-        <w:t xml:space="preserve">3. </w:t>
-      </w:r>
-      <w:r>
-        <w:t>Если Windows покажет предупреждение «Разрешить этому приложению вносить изменения на вашем устройстве?», проверьте название программы и нажмите «Да» только если установка разрешена ответственным лицом.</w:t>
-      </w:r>
-    </w:p>
-    <w:p>
-      <w:pPr>
-        <w:ind w:left="397" w:hanging="255"/>
-      </w:pPr>
-      <w:r>
-        <w:rPr>
-          <w:b/>
-        </w:rPr>
-        <w:t xml:space="preserve">4. </w:t>
-      </w:r>
-      <w:r>
-        <w:t>Если появится мастер установки, нажмите «Далее». Не меняйте папку установки, если администратор не дал отдельное указание.</w:t>
-      </w:r>
-    </w:p>
-    <w:p>
-      <w:pPr>
-        <w:ind w:left="397" w:hanging="255"/>
-      </w:pPr>
-      <w:r>
-        <w:rPr>
-          <w:b/>
-        </w:rPr>
-        <w:t xml:space="preserve">5. </w:t>
-      </w:r>
-      <w:r>
-        <w:t>Если мастер предложит создать ярлык на рабочем столе, оставьте этот пункт включённым. Ярлык облегчит запуск программы для пользователей без опыта.</w:t>
-      </w:r>
-    </w:p>
-    <w:p>
-      <w:pPr>
-        <w:ind w:left="397" w:hanging="255"/>
-      </w:pPr>
-      <w:r>
-        <w:rPr>
-          <w:b/>
-        </w:rPr>
-        <w:t xml:space="preserve">6. </w:t>
-      </w:r>
-      <w:r>
-        <w:t>Нажмите «Установить» и дождитесь окончания копирования файлов. Во время установки не выключайте компьютер и не закрывайте окно.</w:t>
-      </w:r>
-    </w:p>
-    <w:p>
-      <w:pPr>
-        <w:ind w:left="397" w:hanging="255"/>
-      </w:pPr>
-      <w:r>
-        <w:rPr>
-          <w:b/>
-        </w:rPr>
-        <w:t xml:space="preserve">7. </w:t>
-      </w:r>
-      <w:r>
-        <w:t>После завершения нажмите «Готово». Если есть пункт «Запустить ClassCalendar», можно оставить его включённым.</w:t>
-      </w:r>
-    </w:p>
-    <w:p>
-      <w:pPr>
-        <w:ind w:left="397" w:hanging="255"/>
-      </w:pPr>
-      <w:r>
-        <w:rPr>
-          <w:b/>
-        </w:rPr>
-        <w:t xml:space="preserve">8. </w:t>
-      </w:r>
-      <w:r>
-        <w:t>Убедитесь, что приложение запускается: на экране должен открыться календарь.</w:t>
-      </w:r>
-    </w:p>
-    <w:p>
-      <w:pPr>
-        <w:jc w:val="center"/>
-      </w:pPr>
-      <w:r>
-        <w:drawing>
-          <wp:inline xmlns:a="http://schemas.openxmlformats.org/drawingml/2006/main" xmlns:pic="http://schemas.openxmlformats.org/drawingml/2006/picture">
-            <wp:extent cx="5852160" cy="3291840"/>
-            <wp:docPr id="2" name="Picture 2"/>
-            <wp:cNvGraphicFramePr>
-              <a:graphicFrameLocks noChangeAspect="1"/>
-            </wp:cNvGraphicFramePr>
-            <a:graphic>
-              <a:graphicData uri="http://schemas.openxmlformats.org/drawingml/2006/picture">
-                <pic:pic>
-                  <pic:nvPicPr>
-                    <pic:cNvPr id="0" name="install_windows.png"/>
                     <pic:cNvPicPr/>
                   </pic:nvPicPr>
                   <pic:blipFill>
@@ -2739,7 +2608,7 @@
         <w:jc w:val="center"/>
       </w:pPr>
       <w:r>
-        <w:t>Рисунок 2 — Плейсхолдер скриншота установки на Windows.</w:t>
+        <w:t>Рисунок 1 — Плейсхолдер скриншота установочного файла.</w:t>
       </w:r>
     </w:p>
     <w:p>
@@ -2747,7 +2616,12 @@
         <w:pStyle w:val="Heading2"/>
       </w:pPr>
       <w:r>
-        <w:t>3.3 Первый запуск в Windows после установки</w:t>
+        <w:t>3.2 Установка на Windows</w:t>
+      </w:r>
+    </w:p>
+    <w:p>
+      <w:r>
+        <w:t>Ниже приведён основной порядок установки. Выполняйте действия строго по порядку. Если на экране появляется окно, которого нет в инструкции, не нажимайте случайные кнопки: прочитайте текст окна или обратитесь к ответственному.</w:t>
       </w:r>
     </w:p>
     <w:p>
@@ -2761,7 +2635,7 @@
         <w:t xml:space="preserve">1. </w:t>
       </w:r>
       <w:r>
-        <w:t>Найдите ярлык ClassCalendar или SLSEleven на рабочем столе Windows.</w:t>
+        <w:t>Найдите установочный файл в папке, куда его передал ответственный: обычно это «Загрузки», «Документы» или отдельная папка подразделения.</w:t>
       </w:r>
     </w:p>
     <w:p>
@@ -2775,7 +2649,7 @@
         <w:t xml:space="preserve">2. </w:t>
       </w:r>
       <w:r>
-        <w:t>Щёлкните по ярлыку два раза левой кнопкой мыши.</w:t>
+        <w:t>Щёлкните по файлу два раза левой кнопкой мыши. Если двойной щелчок не получается, щёлкните один раз, затем нажмите клавишу Enter.</w:t>
       </w:r>
     </w:p>
     <w:p>
@@ -2789,7 +2663,7 @@
         <w:t xml:space="preserve">3. </w:t>
       </w:r>
       <w:r>
-        <w:t>Если ярлыка нет, нажмите кнопку «Пуск» в левом нижнем углу экрана и начните вводить ClassCalendar.</w:t>
+        <w:t>Если Windows покажет предупреждение «Разрешить этому приложению вносить изменения на вашем устройстве?», проверьте название программы и нажмите «Да» только если установка разрешена ответственным лицом.</w:t>
       </w:r>
     </w:p>
     <w:p>
@@ -2803,7 +2677,7 @@
         <w:t xml:space="preserve">4. </w:t>
       </w:r>
       <w:r>
-        <w:t>Когда Windows найдёт приложение, щёлкните по нему левой кнопкой мыши.</w:t>
+        <w:t>Если появится мастер установки, нажмите «Далее». Не меняйте папку установки, если администратор не дал отдельное указание.</w:t>
       </w:r>
     </w:p>
     <w:p>
@@ -2817,53 +2691,7 @@
         <w:t xml:space="preserve">5. </w:t>
       </w:r>
       <w:r>
-        <w:t>Дождитесь открытия окна календаря. Первый запуск может занимать больше времени, потому что программа создаёт папку данных.</w:t>
-      </w:r>
-    </w:p>
-    <w:tbl>
-      <w:tblPr>
-        <w:tblW w:type="auto" w:w="0"/>
-        <w:jc w:val="center"/>
-        <w:tblLook w:firstColumn="1" w:firstRow="1" w:lastColumn="0" w:lastRow="0" w:noHBand="0" w:noVBand="1" w:val="04A0"/>
-      </w:tblPr>
-      <w:tblGrid>
-        <w:gridCol w:w="10142"/>
-      </w:tblGrid>
-      <w:tr>
-        <w:tc>
-          <w:tcPr>
-            <w:tcW w:type="dxa" w:w="10142"/>
-            <w:shd w:fill="FFF2CC"/>
-            <w:tcMar>
-              <w:top w:w="130" w:type="dxa"/>
-              <w:start w:w="160" w:type="dxa"/>
-              <w:bottom w:w="130" w:type="dxa"/>
-              <w:end w:w="160" w:type="dxa"/>
-            </w:tcMar>
-          </w:tcPr>
-          <w:p>
-            <w:r>
-              <w:rPr>
-                <w:b/>
-                <w:color w:val="7F6000"/>
-              </w:rPr>
-              <w:t>Важно для подразделения</w:t>
-            </w:r>
-            <w:r>
-              <w:br/>
-              <w:t>Не запускайте одновременно несколько копий программы на одном компьютере. Если программа уже открыта, работайте в открытом окне. Одновременная работа нескольких пользователей с одним локальным файлом базы не предусмотрена.</w:t>
-            </w:r>
-          </w:p>
-        </w:tc>
-      </w:tr>
-    </w:tbl>
-    <w:p/>
-    <w:p>
-      <w:pPr>
-        <w:pStyle w:val="Heading2"/>
-      </w:pPr>
-      <w:r>
-        <w:t>3.4 Дополнительный вариант: установка на macOS</w:t>
+        <w:t>Если мастер предложит создать ярлык на рабочем столе, оставьте этот пункт включённым. Ярлык облегчит запуск программы для пользователей без опыта.</w:t>
       </w:r>
     </w:p>
     <w:p>
@@ -2874,15 +2702,10 @@
         <w:rPr>
           <w:b/>
         </w:rPr>
-        <w:t xml:space="preserve">1. </w:t>
-      </w:r>
-      <w:r>
-        <w:t>Откройте установочный файл DMG.</w:t>
-      </w:r>
-    </w:p>
-    <w:p>
-      <w:r>
-        <w:t>Ожидаемый результат: Система смонтирует образ и покажет окно установки.</w:t>
+        <w:t xml:space="preserve">6. </w:t>
+      </w:r>
+      <w:r>
+        <w:t>Нажмите «Установить» и дождитесь окончания копирования файлов. Во время установки не выключайте компьютер и не закрывайте окно.</w:t>
       </w:r>
     </w:p>
     <w:p>
@@ -2893,15 +2716,10 @@
         <w:rPr>
           <w:b/>
         </w:rPr>
-        <w:t xml:space="preserve">2. </w:t>
-      </w:r>
-      <w:r>
-        <w:t>Перетащите значок приложения в папку Applications, если такой экран предусмотрен сборкой.</w:t>
-      </w:r>
-    </w:p>
-    <w:p>
-      <w:r>
-        <w:t>Ожидаемый результат: Приложение будет скопировано в каталог программ.</w:t>
+        <w:t xml:space="preserve">7. </w:t>
+      </w:r>
+      <w:r>
+        <w:t>После завершения нажмите «Готово». Если есть пункт «Запустить ClassCalendar», можно оставить его включённым.</w:t>
       </w:r>
     </w:p>
     <w:p>
@@ -2912,34 +2730,10 @@
         <w:rPr>
           <w:b/>
         </w:rPr>
-        <w:t xml:space="preserve">3. </w:t>
-      </w:r>
-      <w:r>
-        <w:t>При первом запуске подтвердите открытие приложения, если macOS показывает предупреждение безопасности.</w:t>
-      </w:r>
-    </w:p>
-    <w:p>
-      <w:r>
-        <w:t>Ожидаемый результат: После подтверждения откроется главное окно календаря.</w:t>
-      </w:r>
-    </w:p>
-    <w:p>
-      <w:pPr>
-        <w:ind w:left="397" w:hanging="255"/>
-      </w:pPr>
-      <w:r>
-        <w:rPr>
-          <w:b/>
-        </w:rPr>
-        <w:t xml:space="preserve">4. </w:t>
-      </w:r>
-      <w:r>
-        <w:t>Если приложение не запускается, откройте его через контекстное меню «Открыть».</w:t>
-      </w:r>
-    </w:p>
-    <w:p>
-      <w:r>
-        <w:t>Ожидаемый результат: macOS повторно запросит подтверждение запуска приложения от проверенного источника или локальной сборки.</w:t>
+        <w:t xml:space="preserve">8. </w:t>
+      </w:r>
+      <w:r>
+        <w:t>Убедитесь, что приложение запускается: на экране должен открыться календарь.</w:t>
       </w:r>
     </w:p>
     <w:p>
@@ -2958,7 +2752,7 @@
               <a:graphicData uri="http://schemas.openxmlformats.org/drawingml/2006/picture">
                 <pic:pic>
                   <pic:nvPicPr>
-                    <pic:cNvPr id="0" name="install_macos.png"/>
+                    <pic:cNvPr id="0" name="install_windows.png"/>
                     <pic:cNvPicPr/>
                   </pic:nvPicPr>
                   <pic:blipFill>
@@ -2987,6 +2781,254 @@
         <w:jc w:val="center"/>
       </w:pPr>
       <w:r>
+        <w:t>Рисунок 2 — Плейсхолдер скриншота установки на Windows.</w:t>
+      </w:r>
+    </w:p>
+    <w:p>
+      <w:pPr>
+        <w:pStyle w:val="Heading2"/>
+      </w:pPr>
+      <w:r>
+        <w:t>3.3 Первый запуск в Windows после установки</w:t>
+      </w:r>
+    </w:p>
+    <w:p>
+      <w:pPr>
+        <w:ind w:left="397" w:hanging="255"/>
+      </w:pPr>
+      <w:r>
+        <w:rPr>
+          <w:b/>
+        </w:rPr>
+        <w:t xml:space="preserve">1. </w:t>
+      </w:r>
+      <w:r>
+        <w:t>Найдите ярлык ClassCalendar или SLSEleven на рабочем столе Windows.</w:t>
+      </w:r>
+    </w:p>
+    <w:p>
+      <w:pPr>
+        <w:ind w:left="397" w:hanging="255"/>
+      </w:pPr>
+      <w:r>
+        <w:rPr>
+          <w:b/>
+        </w:rPr>
+        <w:t xml:space="preserve">2. </w:t>
+      </w:r>
+      <w:r>
+        <w:t>Щёлкните по ярлыку два раза левой кнопкой мыши.</w:t>
+      </w:r>
+    </w:p>
+    <w:p>
+      <w:pPr>
+        <w:ind w:left="397" w:hanging="255"/>
+      </w:pPr>
+      <w:r>
+        <w:rPr>
+          <w:b/>
+        </w:rPr>
+        <w:t xml:space="preserve">3. </w:t>
+      </w:r>
+      <w:r>
+        <w:t>Если ярлыка нет, нажмите кнопку «Пуск» в левом нижнем углу экрана и начните вводить ClassCalendar.</w:t>
+      </w:r>
+    </w:p>
+    <w:p>
+      <w:pPr>
+        <w:ind w:left="397" w:hanging="255"/>
+      </w:pPr>
+      <w:r>
+        <w:rPr>
+          <w:b/>
+        </w:rPr>
+        <w:t xml:space="preserve">4. </w:t>
+      </w:r>
+      <w:r>
+        <w:t>Когда Windows найдёт приложение, щёлкните по нему левой кнопкой мыши.</w:t>
+      </w:r>
+    </w:p>
+    <w:p>
+      <w:pPr>
+        <w:ind w:left="397" w:hanging="255"/>
+      </w:pPr>
+      <w:r>
+        <w:rPr>
+          <w:b/>
+        </w:rPr>
+        <w:t xml:space="preserve">5. </w:t>
+      </w:r>
+      <w:r>
+        <w:t>Дождитесь открытия окна календаря. Первый запуск может занимать больше времени, потому что программа создаёт папку данных.</w:t>
+      </w:r>
+    </w:p>
+    <w:tbl>
+      <w:tblPr>
+        <w:tblW w:type="auto" w:w="0"/>
+        <w:jc w:val="center"/>
+        <w:tblLook w:firstColumn="1" w:firstRow="1" w:lastColumn="0" w:lastRow="0" w:noHBand="0" w:noVBand="1" w:val="04A0"/>
+      </w:tblPr>
+      <w:tblGrid>
+        <w:gridCol w:w="10142"/>
+      </w:tblGrid>
+      <w:tr>
+        <w:tc>
+          <w:tcPr>
+            <w:tcW w:type="dxa" w:w="10142"/>
+            <w:shd w:fill="FFF2CC"/>
+            <w:tcMar>
+              <w:top w:w="130" w:type="dxa"/>
+              <w:start w:w="160" w:type="dxa"/>
+              <w:bottom w:w="130" w:type="dxa"/>
+              <w:end w:w="160" w:type="dxa"/>
+            </w:tcMar>
+          </w:tcPr>
+          <w:p>
+            <w:r>
+              <w:rPr>
+                <w:b/>
+                <w:color w:val="7F6000"/>
+              </w:rPr>
+              <w:t>Важно для подразделения</w:t>
+            </w:r>
+            <w:r>
+              <w:br/>
+              <w:t>Не запускайте одновременно несколько копий программы на одном компьютере. Если программа уже открыта, работайте в открытом окне. Одновременная работа нескольких пользователей с одним локальным файлом базы не предусмотрена.</w:t>
+            </w:r>
+          </w:p>
+        </w:tc>
+      </w:tr>
+    </w:tbl>
+    <w:p/>
+    <w:p>
+      <w:pPr>
+        <w:pStyle w:val="Heading2"/>
+      </w:pPr>
+      <w:r>
+        <w:t>3.4 Дополнительный вариант: установка на macOS</w:t>
+      </w:r>
+    </w:p>
+    <w:p>
+      <w:pPr>
+        <w:ind w:left="397" w:hanging="255"/>
+      </w:pPr>
+      <w:r>
+        <w:rPr>
+          <w:b/>
+        </w:rPr>
+        <w:t xml:space="preserve">1. </w:t>
+      </w:r>
+      <w:r>
+        <w:t>Откройте установочный файл DMG.</w:t>
+      </w:r>
+    </w:p>
+    <w:p>
+      <w:r>
+        <w:t>Ожидаемый результат: Система смонтирует образ и покажет окно установки.</w:t>
+      </w:r>
+    </w:p>
+    <w:p>
+      <w:pPr>
+        <w:ind w:left="397" w:hanging="255"/>
+      </w:pPr>
+      <w:r>
+        <w:rPr>
+          <w:b/>
+        </w:rPr>
+        <w:t xml:space="preserve">2. </w:t>
+      </w:r>
+      <w:r>
+        <w:t>Перетащите значок приложения в папку Applications, если такой экран предусмотрен сборкой.</w:t>
+      </w:r>
+    </w:p>
+    <w:p>
+      <w:r>
+        <w:t>Ожидаемый результат: Приложение будет скопировано в каталог программ.</w:t>
+      </w:r>
+    </w:p>
+    <w:p>
+      <w:pPr>
+        <w:ind w:left="397" w:hanging="255"/>
+      </w:pPr>
+      <w:r>
+        <w:rPr>
+          <w:b/>
+        </w:rPr>
+        <w:t xml:space="preserve">3. </w:t>
+      </w:r>
+      <w:r>
+        <w:t>При первом запуске подтвердите открытие приложения, если macOS показывает предупреждение безопасности.</w:t>
+      </w:r>
+    </w:p>
+    <w:p>
+      <w:r>
+        <w:t>Ожидаемый результат: После подтверждения откроется главное окно календаря.</w:t>
+      </w:r>
+    </w:p>
+    <w:p>
+      <w:pPr>
+        <w:ind w:left="397" w:hanging="255"/>
+      </w:pPr>
+      <w:r>
+        <w:rPr>
+          <w:b/>
+        </w:rPr>
+        <w:t xml:space="preserve">4. </w:t>
+      </w:r>
+      <w:r>
+        <w:t>Если приложение не запускается, откройте его через контекстное меню «Открыть».</w:t>
+      </w:r>
+    </w:p>
+    <w:p>
+      <w:r>
+        <w:t>Ожидаемый результат: macOS повторно запросит подтверждение запуска приложения от проверенного источника или локальной сборки.</w:t>
+      </w:r>
+    </w:p>
+    <w:p>
+      <w:pPr>
+        <w:jc w:val="center"/>
+      </w:pPr>
+      <w:r>
+        <w:drawing>
+          <wp:inline xmlns:a="http://schemas.openxmlformats.org/drawingml/2006/main" xmlns:pic="http://schemas.openxmlformats.org/drawingml/2006/picture">
+            <wp:extent cx="5852160" cy="3291840"/>
+            <wp:docPr id="4" name="Picture 4"/>
+            <wp:cNvGraphicFramePr>
+              <a:graphicFrameLocks noChangeAspect="1"/>
+            </wp:cNvGraphicFramePr>
+            <a:graphic>
+              <a:graphicData uri="http://schemas.openxmlformats.org/drawingml/2006/picture">
+                <pic:pic>
+                  <pic:nvPicPr>
+                    <pic:cNvPr id="0" name="install_macos.png"/>
+                    <pic:cNvPicPr/>
+                  </pic:nvPicPr>
+                  <pic:blipFill>
+                    <a:blip r:embed="rId14"/>
+                    <a:stretch>
+                      <a:fillRect/>
+                    </a:stretch>
+                  </pic:blipFill>
+                  <pic:spPr>
+                    <a:xfrm>
+                      <a:off x="0" y="0"/>
+                      <a:ext cx="5852160" cy="3291840"/>
+                    </a:xfrm>
+                    <a:prstGeom prst="rect"/>
+                  </pic:spPr>
+                </pic:pic>
+              </a:graphicData>
+            </a:graphic>
+          </wp:inline>
+        </w:drawing>
+      </w:r>
+    </w:p>
+    <w:p>
+      <w:pPr>
+        <w:pStyle w:val="Caption"/>
+        <w:jc w:val="center"/>
+      </w:pPr>
+      <w:r>
         <w:t>Рисунок 3 — Плейсхолдер скриншота установки на macOS.</w:t>
       </w:r>
     </w:p>
@@ -3326,7 +3368,7 @@
           </w:tcPr>
           <w:p>
             <w:r>
-              <w:t>Запустите приложение из терминала и передайте текст ошибки в поддержку.</w:t>
+              <w:t>Запустите приложение из терминала и передайте текст ошибки ответственному специалисту.</w:t>
             </w:r>
           </w:p>
         </w:tc>
@@ -3660,7 +3702,7 @@
         <w:drawing>
           <wp:inline xmlns:a="http://schemas.openxmlformats.org/drawingml/2006/main" xmlns:pic="http://schemas.openxmlformats.org/drawingml/2006/picture">
             <wp:extent cx="5852160" cy="4593945"/>
-            <wp:docPr id="4" name="Picture 4"/>
+            <wp:docPr id="5" name="Picture 5"/>
             <wp:cNvGraphicFramePr>
               <a:graphicFrameLocks noChangeAspect="1"/>
             </wp:cNvGraphicFramePr>
@@ -3672,7 +3714,7 @@
                     <pic:cNvPicPr/>
                   </pic:nvPicPr>
                   <pic:blipFill>
-                    <a:blip r:embed="rId14"/>
+                    <a:blip r:embed="rId15"/>
                     <a:stretch>
                       <a:fillRect/>
                     </a:stretch>
@@ -3786,44 +3828,11 @@
         <w:t>4.2 Авторизация</w:t>
       </w:r>
     </w:p>
-    <w:tbl>
-      <w:tblPr>
-        <w:tblW w:type="auto" w:w="0"/>
-        <w:jc w:val="center"/>
-        <w:tblLook w:firstColumn="1" w:firstRow="1" w:lastColumn="0" w:lastRow="0" w:noHBand="0" w:noVBand="1" w:val="04A0"/>
-      </w:tblPr>
-      <w:tblGrid>
-        <w:gridCol w:w="10142"/>
-      </w:tblGrid>
-      <w:tr>
-        <w:tc>
-          <w:tcPr>
-            <w:tcW w:type="dxa" w:w="10142"/>
-            <w:shd w:fill="FFF2CC"/>
-            <w:tcMar>
-              <w:top w:w="130" w:type="dxa"/>
-              <w:start w:w="160" w:type="dxa"/>
-              <w:bottom w:w="130" w:type="dxa"/>
-              <w:end w:w="160" w:type="dxa"/>
-            </w:tcMar>
-          </w:tcPr>
-          <w:p>
-            <w:r>
-              <w:rPr>
-                <w:b/>
-                <w:color w:val="7F6000"/>
-              </w:rPr>
-              <w:t>[Требует уточнения]</w:t>
-            </w:r>
-            <w:r>
-              <w:br/>
-              <w:t>В текущей реализации, найденной в исходном коде, отдельный экран авторизации, роли пользователей и ввод пароля отсутствуют. Документ описывает локальный режим работы на Windows-компьютере. Если в поставке для воинской части добавлена авторизация, этот раздел необходимо дополнить порядком входа, выдачи паролей и смены ответственного пользователя.</w:t>
-            </w:r>
-          </w:p>
-        </w:tc>
-      </w:tr>
-    </w:tbl>
-    <w:p/>
+    <w:p>
+      <w:r>
+        <w:t>Авторизации в приложении нет. При запуске не требуется вводить логин или пароль: после открытия сразу отображается главное окно календаря. Доступ к данным ограничивается средствами Windows, правами пользователя на рабочем месте и правилами хранения резервных копий.</w:t>
+      </w:r>
+    </w:p>
     <w:p>
       <w:pPr>
         <w:pStyle w:val="Heading2"/>
@@ -3861,7 +3870,7 @@
         <w:drawing>
           <wp:inline xmlns:a="http://schemas.openxmlformats.org/drawingml/2006/main" xmlns:pic="http://schemas.openxmlformats.org/drawingml/2006/picture">
             <wp:extent cx="5852160" cy="4593945"/>
-            <wp:docPr id="5" name="Picture 5"/>
+            <wp:docPr id="6" name="Picture 6"/>
             <wp:cNvGraphicFramePr>
               <a:graphicFrameLocks noChangeAspect="1"/>
             </wp:cNvGraphicFramePr>
@@ -3873,7 +3882,7 @@
                     <pic:cNvPicPr/>
                   </pic:nvPicPr>
                   <pic:blipFill>
-                    <a:blip r:embed="rId14"/>
+                    <a:blip r:embed="rId15"/>
                     <a:stretch>
                       <a:fillRect/>
                     </a:stretch>
@@ -4913,7 +4922,7 @@
         <w:drawing>
           <wp:inline xmlns:a="http://schemas.openxmlformats.org/drawingml/2006/main" xmlns:pic="http://schemas.openxmlformats.org/drawingml/2006/picture">
             <wp:extent cx="5852160" cy="4260372"/>
-            <wp:docPr id="6" name="Picture 6"/>
+            <wp:docPr id="7" name="Picture 7"/>
             <wp:cNvGraphicFramePr>
               <a:graphicFrameLocks noChangeAspect="1"/>
             </wp:cNvGraphicFramePr>
@@ -4925,7 +4934,7 @@
                     <pic:cNvPicPr/>
                   </pic:nvPicPr>
                   <pic:blipFill>
-                    <a:blip r:embed="rId15"/>
+                    <a:blip r:embed="rId16"/>
                     <a:stretch>
                       <a:fillRect/>
                     </a:stretch>
@@ -5593,7 +5602,7 @@
         <w:drawing>
           <wp:inline xmlns:a="http://schemas.openxmlformats.org/drawingml/2006/main" xmlns:pic="http://schemas.openxmlformats.org/drawingml/2006/picture">
             <wp:extent cx="5852160" cy="3873066"/>
-            <wp:docPr id="7" name="Picture 7"/>
+            <wp:docPr id="8" name="Picture 8"/>
             <wp:cNvGraphicFramePr>
               <a:graphicFrameLocks noChangeAspect="1"/>
             </wp:cNvGraphicFramePr>
@@ -5605,7 +5614,7 @@
                     <pic:cNvPicPr/>
                   </pic:nvPicPr>
                   <pic:blipFill>
-                    <a:blip r:embed="rId16"/>
+                    <a:blip r:embed="rId17"/>
                     <a:stretch>
                       <a:fillRect/>
                     </a:stretch>
@@ -12896,7 +12905,7 @@
           </w:tcPr>
           <w:p>
             <w:r>
-              <w:t>Пароли</w:t>
+              <w:t>Пароли приложения</w:t>
             </w:r>
           </w:p>
         </w:tc>
@@ -12913,7 +12922,7 @@
           </w:tcPr>
           <w:p>
             <w:r>
-              <w:t>[Требует уточнения] В найденной реализации экран пароля отсутствует.</w:t>
+              <w:t>Пароля в приложении нет.</w:t>
             </w:r>
           </w:p>
         </w:tc>
@@ -14060,7 +14069,7 @@
     </w:p>
     <w:p>
       <w:r>
-        <w:t>Они обозначают сведения, которых не было в исходных материалах: официальные роли, регламент авторизации, точные аппаратные требования и финальный логотип. Эти места можно заменить после уточнения у владельца продукта.</w:t>
+        <w:t>Они обозначают сведения, которые зависят от конкретной поставки или требуют проверки на рабочем месте, например горячие клавиши или аппаратные требования.</w:t>
       </w:r>
     </w:p>
     <w:p>
@@ -14768,7 +14777,7 @@
         <w:pStyle w:val="Heading2"/>
       </w:pPr>
       <w:r>
-        <w:t>12.3 Контакты поддержки</w:t>
+        <w:t>12.3 Авторы</w:t>
       </w:r>
     </w:p>
     <w:tbl>
@@ -14807,7 +14816,7 @@
                 <w:b/>
                 <w:color w:val="FFFFFF"/>
               </w:rPr>
-              <w:t>Канал</w:t>
+              <w:t>Роль</w:t>
             </w:r>
           </w:p>
         </w:tc>
@@ -14832,7 +14841,7 @@
                 <w:b/>
                 <w:color w:val="FFFFFF"/>
               </w:rPr>
-              <w:t>Значение</w:t>
+              <w:t>ФИО</w:t>
             </w:r>
           </w:p>
         </w:tc>
@@ -14851,7 +14860,7 @@
           </w:tcPr>
           <w:p>
             <w:r>
-              <w:t>Ответственная организация</w:t>
+              <w:t>Автор</w:t>
             </w:r>
           </w:p>
         </w:tc>
@@ -14868,7 +14877,7 @@
           </w:tcPr>
           <w:p>
             <w:r>
-              <w:t>SLSEleven [Требует уточнения]</w:t>
+              <w:t>Капитан 2 ранга Киселев О.А.</w:t>
             </w:r>
           </w:p>
         </w:tc>
@@ -14887,7 +14896,7 @@
           </w:tcPr>
           <w:p>
             <w:r>
-              <w:t>Электронная почта</w:t>
+              <w:t>Автор</w:t>
             </w:r>
           </w:p>
         </w:tc>
@@ -14904,79 +14913,7 @@
           </w:tcPr>
           <w:p>
             <w:r>
-              <w:t>[Требует уточнения]</w:t>
-            </w:r>
-          </w:p>
-        </w:tc>
-      </w:tr>
-      <w:tr>
-        <w:tc>
-          <w:tcPr>
-            <w:tcW w:type="dxa" w:w="2835"/>
-            <w:tcMar>
-              <w:top w:w="90" w:type="dxa"/>
-              <w:start w:w="110" w:type="dxa"/>
-              <w:bottom w:w="90" w:type="dxa"/>
-              <w:end w:w="110" w:type="dxa"/>
-            </w:tcMar>
-            <w:vAlign w:val="center"/>
-          </w:tcPr>
-          <w:p>
-            <w:r>
-              <w:t>Система заявок</w:t>
-            </w:r>
-          </w:p>
-        </w:tc>
-        <w:tc>
-          <w:tcPr>
-            <w:tcW w:type="dxa" w:w="5669"/>
-            <w:tcMar>
-              <w:top w:w="90" w:type="dxa"/>
-              <w:start w:w="110" w:type="dxa"/>
-              <w:bottom w:w="90" w:type="dxa"/>
-              <w:end w:w="110" w:type="dxa"/>
-            </w:tcMar>
-            <w:vAlign w:val="center"/>
-          </w:tcPr>
-          <w:p>
-            <w:r>
-              <w:t>[Требует уточнения]</w:t>
-            </w:r>
-          </w:p>
-        </w:tc>
-      </w:tr>
-      <w:tr>
-        <w:tc>
-          <w:tcPr>
-            <w:tcW w:type="dxa" w:w="2835"/>
-            <w:tcMar>
-              <w:top w:w="90" w:type="dxa"/>
-              <w:start w:w="110" w:type="dxa"/>
-              <w:bottom w:w="90" w:type="dxa"/>
-              <w:end w:w="110" w:type="dxa"/>
-            </w:tcMar>
-            <w:vAlign w:val="center"/>
-          </w:tcPr>
-          <w:p>
-            <w:r>
-              <w:t>Что прикладывать к обращению</w:t>
-            </w:r>
-          </w:p>
-        </w:tc>
-        <w:tc>
-          <w:tcPr>
-            <w:tcW w:type="dxa" w:w="5669"/>
-            <w:tcMar>
-              <w:top w:w="90" w:type="dxa"/>
-              <w:start w:w="110" w:type="dxa"/>
-              <w:bottom w:w="90" w:type="dxa"/>
-              <w:end w:w="110" w:type="dxa"/>
-            </w:tcMar>
-            <w:vAlign w:val="center"/>
-          </w:tcPr>
-          <w:p>
-            <w:r>
-              <w:t>Версию приложения, описание действия, текст ошибки, скриншот, при необходимости обезличенный пример файла импорта.</w:t>
+              <w:t>Старший матрос Гладких Е.Ю.</w:t>
             </w:r>
           </w:p>
         </w:tc>

</xml_diff>

<commit_message>
Refine manual classification and product details
</commit_message>
<xml_diff>
--- a/docs/SLSEleven_User_Manual_FULL.docx
+++ b/docs/SLSEleven_User_Manual_FULL.docx
@@ -2,6 +2,19 @@
 <file path=word/document.xml><?xml version="1.0" encoding="utf-8"?>
 <w:document xmlns:wpc="http://schemas.microsoft.com/office/word/2010/wordprocessingCanvas" xmlns:mo="http://schemas.microsoft.com/office/mac/office/2008/main" xmlns:mc="http://schemas.openxmlformats.org/markup-compatibility/2006" xmlns:mv="urn:schemas-microsoft-com:mac:vml" xmlns:o="urn:schemas-microsoft-com:office:office" xmlns:r="http://schemas.openxmlformats.org/officeDocument/2006/relationships" xmlns:m="http://schemas.openxmlformats.org/officeDocument/2006/math" xmlns:v="urn:schemas-microsoft-com:vml" xmlns:wp14="http://schemas.microsoft.com/office/word/2010/wordprocessingDrawing" xmlns:wp="http://schemas.openxmlformats.org/drawingml/2006/wordprocessingDrawing" xmlns:w10="urn:schemas-microsoft-com:office:word" xmlns:w="http://schemas.openxmlformats.org/wordprocessingml/2006/main" xmlns:w14="http://schemas.microsoft.com/office/word/2010/wordml" xmlns:wpg="http://schemas.microsoft.com/office/word/2010/wordprocessingGroup" xmlns:wpi="http://schemas.microsoft.com/office/word/2010/wordprocessingInk" xmlns:wne="http://schemas.microsoft.com/office/word/2006/wordml" xmlns:wps="http://schemas.microsoft.com/office/word/2010/wordprocessingShape" mc:Ignorable="w14 wp14">
   <w:body>
+    <w:p>
+      <w:pPr>
+        <w:jc w:val="right"/>
+      </w:pPr>
+      <w:r>
+        <w:rPr>
+          <w:b/>
+          <w:color w:val="C00000"/>
+          <w:sz w:val="28"/>
+        </w:rPr>
+        <w:t>ДСП</w:t>
+      </w:r>
+    </w:p>
     <w:p>
       <w:pPr>
         <w:jc w:val="center"/>
@@ -60,18 +73,6 @@
       </w:pPr>
       <w:r>
         <w:rPr>
-          <w:color w:val="2F75B5"/>
-          <w:sz w:val="44"/>
-        </w:rPr>
-        <w:t>ClassCalendar</w:t>
-      </w:r>
-    </w:p>
-    <w:p>
-      <w:pPr>
-        <w:jc w:val="center"/>
-      </w:pPr>
-      <w:r>
-        <w:rPr>
           <w:b/>
           <w:sz w:val="32"/>
         </w:rPr>
@@ -178,7 +179,7 @@
           </w:tcPr>
           <w:p>
             <w:r>
-              <w:t>SLSEleven / ClassCalendar</w:t>
+              <w:t>SLSEleven</w:t>
             </w:r>
           </w:p>
         </w:tc>
@@ -360,7 +361,43 @@
           </w:tcPr>
           <w:p>
             <w:r>
-              <w:t>SLSEleven</w:t>
+              <w:t>воинская часть 56529-2</w:t>
+            </w:r>
+          </w:p>
+        </w:tc>
+      </w:tr>
+      <w:tr>
+        <w:tc>
+          <w:tcPr>
+            <w:tcW w:type="dxa" w:w="2948"/>
+            <w:tcMar>
+              <w:top w:w="90" w:type="dxa"/>
+              <w:start w:w="110" w:type="dxa"/>
+              <w:bottom w:w="90" w:type="dxa"/>
+              <w:end w:w="110" w:type="dxa"/>
+            </w:tcMar>
+            <w:vAlign w:val="center"/>
+          </w:tcPr>
+          <w:p>
+            <w:r>
+              <w:t>Гриф</w:t>
+            </w:r>
+          </w:p>
+        </w:tc>
+        <w:tc>
+          <w:tcPr>
+            <w:tcW w:type="dxa" w:w="5953"/>
+            <w:tcMar>
+              <w:top w:w="90" w:type="dxa"/>
+              <w:start w:w="110" w:type="dxa"/>
+              <w:bottom w:w="90" w:type="dxa"/>
+              <w:end w:w="110" w:type="dxa"/>
+            </w:tcMar>
+            <w:vAlign w:val="center"/>
+          </w:tcPr>
+          <w:p>
+            <w:r>
+              <w:t>ДСП</w:t>
             </w:r>
           </w:p>
         </w:tc>
@@ -1973,7 +2010,7 @@
           </w:tcPr>
           <w:p>
             <w:r>
-              <w:t>Windows 7</w:t>
+              <w:t>Windows 7 x64/x86</w:t>
             </w:r>
           </w:p>
         </w:tc>
@@ -1990,7 +2027,7 @@
           </w:tcPr>
           <w:p>
             <w:r>
-              <w:t>Windows 10/11 с установленными обновлениями</w:t>
+              <w:t>Windows 10/11 x64 с установленными обновлениями</w:t>
             </w:r>
           </w:p>
         </w:tc>
@@ -2565,54 +2602,6 @@
     </w:p>
     <w:p>
       <w:pPr>
-        <w:jc w:val="center"/>
-      </w:pPr>
-      <w:r>
-        <w:drawing>
-          <wp:inline xmlns:a="http://schemas.openxmlformats.org/drawingml/2006/main" xmlns:pic="http://schemas.openxmlformats.org/drawingml/2006/picture">
-            <wp:extent cx="5852160" cy="3291840"/>
-            <wp:docPr id="2" name="Picture 2"/>
-            <wp:cNvGraphicFramePr>
-              <a:graphicFrameLocks noChangeAspect="1"/>
-            </wp:cNvGraphicFramePr>
-            <a:graphic>
-              <a:graphicData uri="http://schemas.openxmlformats.org/drawingml/2006/picture">
-                <pic:pic>
-                  <pic:nvPicPr>
-                    <pic:cNvPr id="0" name="install_file.png"/>
-                    <pic:cNvPicPr/>
-                  </pic:nvPicPr>
-                  <pic:blipFill>
-                    <a:blip r:embed="rId12"/>
-                    <a:stretch>
-                      <a:fillRect/>
-                    </a:stretch>
-                  </pic:blipFill>
-                  <pic:spPr>
-                    <a:xfrm>
-                      <a:off x="0" y="0"/>
-                      <a:ext cx="5852160" cy="3291840"/>
-                    </a:xfrm>
-                    <a:prstGeom prst="rect"/>
-                  </pic:spPr>
-                </pic:pic>
-              </a:graphicData>
-            </a:graphic>
-          </wp:inline>
-        </w:drawing>
-      </w:r>
-    </w:p>
-    <w:p>
-      <w:pPr>
-        <w:pStyle w:val="Caption"/>
-        <w:jc w:val="center"/>
-      </w:pPr>
-      <w:r>
-        <w:t>Рисунок 1 — Плейсхолдер скриншота установочного файла.</w:t>
-      </w:r>
-    </w:p>
-    <w:p>
-      <w:pPr>
         <w:pStyle w:val="Heading2"/>
       </w:pPr>
       <w:r>
@@ -2719,7 +2708,7 @@
         <w:t xml:space="preserve">7. </w:t>
       </w:r>
       <w:r>
-        <w:t>После завершения нажмите «Готово». Если есть пункт «Запустить ClassCalendar», можно оставить его включённым.</w:t>
+        <w:t>После завершения нажмите «Готово». Если есть пункт «Запустить SLSEleven», можно оставить его включённым.</w:t>
       </w:r>
     </w:p>
     <w:p>
@@ -2738,54 +2727,6 @@
     </w:p>
     <w:p>
       <w:pPr>
-        <w:jc w:val="center"/>
-      </w:pPr>
-      <w:r>
-        <w:drawing>
-          <wp:inline xmlns:a="http://schemas.openxmlformats.org/drawingml/2006/main" xmlns:pic="http://schemas.openxmlformats.org/drawingml/2006/picture">
-            <wp:extent cx="5852160" cy="3291840"/>
-            <wp:docPr id="3" name="Picture 3"/>
-            <wp:cNvGraphicFramePr>
-              <a:graphicFrameLocks noChangeAspect="1"/>
-            </wp:cNvGraphicFramePr>
-            <a:graphic>
-              <a:graphicData uri="http://schemas.openxmlformats.org/drawingml/2006/picture">
-                <pic:pic>
-                  <pic:nvPicPr>
-                    <pic:cNvPr id="0" name="install_windows.png"/>
-                    <pic:cNvPicPr/>
-                  </pic:nvPicPr>
-                  <pic:blipFill>
-                    <a:blip r:embed="rId13"/>
-                    <a:stretch>
-                      <a:fillRect/>
-                    </a:stretch>
-                  </pic:blipFill>
-                  <pic:spPr>
-                    <a:xfrm>
-                      <a:off x="0" y="0"/>
-                      <a:ext cx="5852160" cy="3291840"/>
-                    </a:xfrm>
-                    <a:prstGeom prst="rect"/>
-                  </pic:spPr>
-                </pic:pic>
-              </a:graphicData>
-            </a:graphic>
-          </wp:inline>
-        </w:drawing>
-      </w:r>
-    </w:p>
-    <w:p>
-      <w:pPr>
-        <w:pStyle w:val="Caption"/>
-        <w:jc w:val="center"/>
-      </w:pPr>
-      <w:r>
-        <w:t>Рисунок 2 — Плейсхолдер скриншота установки на Windows.</w:t>
-      </w:r>
-    </w:p>
-    <w:p>
-      <w:pPr>
         <w:pStyle w:val="Heading2"/>
       </w:pPr>
       <w:r>
@@ -2803,7 +2744,7 @@
         <w:t xml:space="preserve">1. </w:t>
       </w:r>
       <w:r>
-        <w:t>Найдите ярлык ClassCalendar или SLSEleven на рабочем столе Windows.</w:t>
+        <w:t>Найдите ярлык SLSEleven на рабочем столе Windows.</w:t>
       </w:r>
     </w:p>
     <w:p>
@@ -2831,7 +2772,7 @@
         <w:t xml:space="preserve">3. </w:t>
       </w:r>
       <w:r>
-        <w:t>Если ярлыка нет, нажмите кнопку «Пуск» в левом нижнем углу экрана и начните вводить ClassCalendar.</w:t>
+        <w:t>Если ярлыка нет, нажмите кнопку «Пуск» в левом нижнем углу экрана и начните вводить SLSEleven.</w:t>
       </w:r>
     </w:p>
     <w:p>
@@ -2982,54 +2923,6 @@
     <w:p>
       <w:r>
         <w:t>Ожидаемый результат: macOS повторно запросит подтверждение запуска приложения от проверенного источника или локальной сборки.</w:t>
-      </w:r>
-    </w:p>
-    <w:p>
-      <w:pPr>
-        <w:jc w:val="center"/>
-      </w:pPr>
-      <w:r>
-        <w:drawing>
-          <wp:inline xmlns:a="http://schemas.openxmlformats.org/drawingml/2006/main" xmlns:pic="http://schemas.openxmlformats.org/drawingml/2006/picture">
-            <wp:extent cx="5852160" cy="3291840"/>
-            <wp:docPr id="4" name="Picture 4"/>
-            <wp:cNvGraphicFramePr>
-              <a:graphicFrameLocks noChangeAspect="1"/>
-            </wp:cNvGraphicFramePr>
-            <a:graphic>
-              <a:graphicData uri="http://schemas.openxmlformats.org/drawingml/2006/picture">
-                <pic:pic>
-                  <pic:nvPicPr>
-                    <pic:cNvPr id="0" name="install_macos.png"/>
-                    <pic:cNvPicPr/>
-                  </pic:nvPicPr>
-                  <pic:blipFill>
-                    <a:blip r:embed="rId14"/>
-                    <a:stretch>
-                      <a:fillRect/>
-                    </a:stretch>
-                  </pic:blipFill>
-                  <pic:spPr>
-                    <a:xfrm>
-                      <a:off x="0" y="0"/>
-                      <a:ext cx="5852160" cy="3291840"/>
-                    </a:xfrm>
-                    <a:prstGeom prst="rect"/>
-                  </pic:spPr>
-                </pic:pic>
-              </a:graphicData>
-            </a:graphic>
-          </wp:inline>
-        </w:drawing>
-      </w:r>
-    </w:p>
-    <w:p>
-      <w:pPr>
-        <w:pStyle w:val="Caption"/>
-        <w:jc w:val="center"/>
-      </w:pPr>
-      <w:r>
-        <w:t>Рисунок 3 — Плейсхолдер скриншота установки на macOS.</w:t>
       </w:r>
     </w:p>
     <w:p>
@@ -3702,7 +3595,7 @@
         <w:drawing>
           <wp:inline xmlns:a="http://schemas.openxmlformats.org/drawingml/2006/main" xmlns:pic="http://schemas.openxmlformats.org/drawingml/2006/picture">
             <wp:extent cx="5852160" cy="4593945"/>
-            <wp:docPr id="5" name="Picture 5"/>
+            <wp:docPr id="2" name="Picture 2"/>
             <wp:cNvGraphicFramePr>
               <a:graphicFrameLocks noChangeAspect="1"/>
             </wp:cNvGraphicFramePr>
@@ -3714,7 +3607,7 @@
                     <pic:cNvPicPr/>
                   </pic:nvPicPr>
                   <pic:blipFill>
-                    <a:blip r:embed="rId15"/>
+                    <a:blip r:embed="rId12"/>
                     <a:stretch>
                       <a:fillRect/>
                     </a:stretch>
@@ -3739,7 +3632,7 @@
         <w:jc w:val="center"/>
       </w:pPr>
       <w:r>
-        <w:t>Рисунок 4 — Первый запуск приложения.</w:t>
+        <w:t>Рисунок 1 — Первый запуск приложения.</w:t>
       </w:r>
     </w:p>
     <w:p>
@@ -3870,7 +3763,7 @@
         <w:drawing>
           <wp:inline xmlns:a="http://schemas.openxmlformats.org/drawingml/2006/main" xmlns:pic="http://schemas.openxmlformats.org/drawingml/2006/picture">
             <wp:extent cx="5852160" cy="4593945"/>
-            <wp:docPr id="6" name="Picture 6"/>
+            <wp:docPr id="3" name="Picture 3"/>
             <wp:cNvGraphicFramePr>
               <a:graphicFrameLocks noChangeAspect="1"/>
             </wp:cNvGraphicFramePr>
@@ -3882,7 +3775,7 @@
                     <pic:cNvPicPr/>
                   </pic:nvPicPr>
                   <pic:blipFill>
-                    <a:blip r:embed="rId15"/>
+                    <a:blip r:embed="rId12"/>
                     <a:stretch>
                       <a:fillRect/>
                     </a:stretch>
@@ -3907,7 +3800,7 @@
         <w:jc w:val="center"/>
       </w:pPr>
       <w:r>
-        <w:t>Рисунок 5 — Общий вид календаря в окне 800 x 600.</w:t>
+        <w:t>Рисунок 2 — Общий вид календаря в окне 800 x 600.</w:t>
       </w:r>
     </w:p>
     <w:tbl>
@@ -4922,7 +4815,7 @@
         <w:drawing>
           <wp:inline xmlns:a="http://schemas.openxmlformats.org/drawingml/2006/main" xmlns:pic="http://schemas.openxmlformats.org/drawingml/2006/picture">
             <wp:extent cx="5852160" cy="4260372"/>
-            <wp:docPr id="7" name="Picture 7"/>
+            <wp:docPr id="4" name="Picture 4"/>
             <wp:cNvGraphicFramePr>
               <a:graphicFrameLocks noChangeAspect="1"/>
             </wp:cNvGraphicFramePr>
@@ -4934,7 +4827,7 @@
                     <pic:cNvPicPr/>
                   </pic:nvPicPr>
                   <pic:blipFill>
-                    <a:blip r:embed="rId16"/>
+                    <a:blip r:embed="rId13"/>
                     <a:stretch>
                       <a:fillRect/>
                     </a:stretch>
@@ -4959,7 +4852,7 @@
         <w:jc w:val="center"/>
       </w:pPr>
       <w:r>
-        <w:t>Рисунок 6 — Экран «Все занятия».</w:t>
+        <w:t>Рисунок 3 — Экран «Все занятия».</w:t>
       </w:r>
     </w:p>
     <w:tbl>
@@ -5602,7 +5495,7 @@
         <w:drawing>
           <wp:inline xmlns:a="http://schemas.openxmlformats.org/drawingml/2006/main" xmlns:pic="http://schemas.openxmlformats.org/drawingml/2006/picture">
             <wp:extent cx="5852160" cy="3873066"/>
-            <wp:docPr id="8" name="Picture 8"/>
+            <wp:docPr id="5" name="Picture 5"/>
             <wp:cNvGraphicFramePr>
               <a:graphicFrameLocks noChangeAspect="1"/>
             </wp:cNvGraphicFramePr>
@@ -5614,7 +5507,7 @@
                     <pic:cNvPicPr/>
                   </pic:nvPicPr>
                   <pic:blipFill>
-                    <a:blip r:embed="rId17"/>
+                    <a:blip r:embed="rId14"/>
                     <a:stretch>
                       <a:fillRect/>
                     </a:stretch>
@@ -5639,7 +5532,7 @@
         <w:jc w:val="center"/>
       </w:pPr>
       <w:r>
-        <w:t>Рисунок 7 — Экран «Авторасписание».</w:t>
+        <w:t>Рисунок 4 — Экран «Авторасписание».</w:t>
       </w:r>
     </w:p>
     <w:tbl>
@@ -15036,7 +14929,7 @@
         <w:color w:val="595959"/>
         <w:sz w:val="17"/>
       </w:rPr>
-      <w:t>SLSEleven / ClassCalendar. Руководство пользователя</w:t>
+      <w:t>ДСП. SLSEleven. Руководство пользователя</w:t>
     </w:r>
   </w:p>
 </w:hdr>

</xml_diff>